<commit_message>
Paper 5: add Policy Significance Statement and Data & Policy declarations
Data & Policy requires a Policy Significance Statement on every research
article, places funding under "Financial Support" rather than in the
acknowledgements, and prints competing interests in the main manuscript.
The manuscript now carries all three, with the declarations gathered under
a single heading.

The abstract was 329 words against a 300-word norm; trimmed to 308 without
dropping a claim. abstract_plain.txt and policy_significance_plain.txt are
the plain-text forms the submission form pastes into, generated from the
manuscript and checked for LaTeX residue.

Build: 7,407 words including footnotes, 16 pages, anonymity audit clean.

Co-Authored-By: Claude Opus 5 <noreply@anthropic.com>
Claude-Session: https://claude.ai/code/session_012NgwaUXsd86P5pxtpLwPwh
</commit_message>
<xml_diff>
--- a/docs/research/provenance_paper/submission_manuscript_anonymous.docx
+++ b/docs/research/provenance_paper/submission_manuscript_anonymous.docx
@@ -138,157 +138,225 @@
         <w:t xml:space="preserve"> </w:t>
       </w:r>
       <w:r>
-        <w:t xml:space="preserve">regulatory technology, legal research, and language models grounded in</w:t>
-      </w:r>
-      <w:r>
-        <w:t xml:space="preserve"> </w:t>
-      </w:r>
-      <w:r>
-        <w:t xml:space="preserve">statutory text. All of it assumes that the official record is available when</w:t>
-      </w:r>
-      <w:r>
-        <w:t xml:space="preserve"> </w:t>
-      </w:r>
-      <w:r>
-        <w:t xml:space="preserve">needed and internally consistent when read. That assumption is rarely tested,</w:t>
-      </w:r>
-      <w:r>
-        <w:t xml:space="preserve"> </w:t>
-      </w:r>
-      <w:r>
-        <w:t xml:space="preserve">because testing it requires a contemporaneous record of what each attempt to</w:t>
-      </w:r>
-      <w:r>
-        <w:t xml:space="preserve"> </w:t>
-      </w:r>
-      <w:r>
-        <w:t xml:space="preserve">retrieve the official text actually returned. This article reports one. In</w:t>
-      </w:r>
-      <w:r>
-        <w:t xml:space="preserve"> </w:t>
-      </w:r>
-      <w:r>
-        <w:t xml:space="preserve">building a corpus of Saudi Arabian legislation, every verified article was</w:t>
-      </w:r>
-      <w:r>
-        <w:t xml:space="preserve"> </w:t>
-      </w:r>
-      <w:r>
-        <w:t xml:space="preserve">annotated with the sources consulted and how they were reconciled, and every</w:t>
-      </w:r>
-      <w:r>
-        <w:t xml:space="preserve"> </w:t>
-      </w:r>
-      <w:r>
-        <w:t xml:space="preserve">instrument was assigned a verification tier by hand. Measured over the 11,704</w:t>
-      </w:r>
-      <w:r>
-        <w:t xml:space="preserve"> </w:t>
-      </w:r>
-      <w:r>
-        <w:t xml:space="preserve">articles whose record names its sources, the official source was unreachable</w:t>
-      </w:r>
-      <w:r>
-        <w:t xml:space="preserve"> </w:t>
-      </w:r>
-      <w:r>
-        <w:t xml:space="preserve">for 20.0 per cent of them, covering 28.0 per cent of instruments; 20.9 per cent</w:t>
-      </w:r>
-      <w:r>
-        <w:t xml:space="preserve"> </w:t>
-      </w:r>
-      <w:r>
-        <w:t xml:space="preserve">were obtained through a web archive, and two thirds of those cases coincide</w:t>
-      </w:r>
-      <w:r>
-        <w:t xml:space="preserve"> </w:t>
-      </w:r>
-      <w:r>
-        <w:t xml:space="preserve">with a recorded unavailability of the live source; 8.2 per cent required</w:t>
-      </w:r>
-      <w:r>
-        <w:t xml:space="preserve"> </w:t>
-      </w:r>
-      <w:r>
-        <w:t xml:space="preserve">optical reconstruction; and 4.9 per cent record a defect in the official text</w:t>
-      </w:r>
-      <w:r>
-        <w:t xml:space="preserve"> </w:t>
-      </w:r>
-      <w:r>
-        <w:t xml:space="preserve">itself. Weighted by article, 17.0 per cent of the corpus has no cross-verified</w:t>
-      </w:r>
-      <w:r>
-        <w:t xml:space="preserve"> </w:t>
-      </w:r>
-      <w:r>
-        <w:t xml:space="preserve">official primary source behind it, and the coverage of the sample makes that an</w:t>
-      </w:r>
-      <w:r>
-        <w:t xml:space="preserve"> </w:t>
-      </w:r>
-      <w:r>
-        <w:t xml:space="preserve">underestimate. In four instruments the official record contradicts itself</w:t>
-      </w:r>
-      <w:r>
-        <w:t xml:space="preserve"> </w:t>
-      </w:r>
-      <w:r>
-        <w:t xml:space="preserve">across nine articles: the provision the portal displays and the amendment log</w:t>
-      </w:r>
-      <w:r>
-        <w:t xml:space="preserve"> </w:t>
-      </w:r>
-      <w:r>
-        <w:t xml:space="preserve">the same portal publishes do not agree. We draw three conclusions for the</w:t>
-      </w:r>
-      <w:r>
-        <w:t xml:space="preserve"> </w:t>
-      </w:r>
-      <w:r>
-        <w:t xml:space="preserve">publishers and users of official data. Web archives are load-bearing</w:t>
-      </w:r>
-      <w:r>
-        <w:t xml:space="preserve"> </w:t>
-      </w:r>
-      <w:r>
-        <w:t xml:space="preserve">infrastructure for public-record research, and hold that position with no</w:t>
-      </w:r>
-      <w:r>
-        <w:t xml:space="preserve"> </w:t>
-      </w:r>
-      <w:r>
-        <w:t xml:space="preserve">mandate and no guarantee of permanence. Availability and internal consistency</w:t>
-      </w:r>
-      <w:r>
-        <w:t xml:space="preserve"> </w:t>
-      </w:r>
-      <w:r>
-        <w:t xml:space="preserve">are distinct properties and need separate measurement. And a public dataset</w:t>
-      </w:r>
-      <w:r>
-        <w:t xml:space="preserve"> </w:t>
-      </w:r>
-      <w:r>
-        <w:t xml:space="preserve">should carry the strength of the evidence behind each record, for which we</w:t>
-      </w:r>
-      <w:r>
-        <w:t xml:space="preserve"> </w:t>
-      </w:r>
-      <w:r>
-        <w:t xml:space="preserve">propose a minimal five-field provenance schema derived from what this corpus</w:t>
-      </w:r>
-      <w:r>
-        <w:t xml:space="preserve"> </w:t>
-      </w:r>
-      <w:r>
-        <w:t xml:space="preserve">recorded in free text — and from the 24 per cent of its own provenance values</w:t>
-      </w:r>
-      <w:r>
-        <w:t xml:space="preserve"> </w:t>
-      </w:r>
-      <w:r>
-        <w:t xml:space="preserve">that turned out not to be provenance statements at all.</w:t>
+        <w:t xml:space="preserve">regulatory technology, and models grounded in statutory text. All of it assumes</w:t>
+      </w:r>
+      <w:r>
+        <w:t xml:space="preserve"> </w:t>
+      </w:r>
+      <w:r>
+        <w:t xml:space="preserve">the official record is available when needed and internally consistent when</w:t>
+      </w:r>
+      <w:r>
+        <w:t xml:space="preserve"> </w:t>
+      </w:r>
+      <w:r>
+        <w:t xml:space="preserve">read. That assumption is rarely tested, because testing it requires a</w:t>
+      </w:r>
+      <w:r>
+        <w:t xml:space="preserve"> </w:t>
+      </w:r>
+      <w:r>
+        <w:t xml:space="preserve">contemporaneous account of what each attempt to retrieve the official text</w:t>
+      </w:r>
+      <w:r>
+        <w:t xml:space="preserve"> </w:t>
+      </w:r>
+      <w:r>
+        <w:t xml:space="preserve">returned. This article reports one. In building a corpus of Saudi Arabian</w:t>
+      </w:r>
+      <w:r>
+        <w:t xml:space="preserve"> </w:t>
+      </w:r>
+      <w:r>
+        <w:t xml:space="preserve">legislation, every verified article was annotated with the sources consulted</w:t>
+      </w:r>
+      <w:r>
+        <w:t xml:space="preserve"> </w:t>
+      </w:r>
+      <w:r>
+        <w:t xml:space="preserve">and how they were reconciled, and every instrument was assigned a verification</w:t>
+      </w:r>
+      <w:r>
+        <w:t xml:space="preserve"> </w:t>
+      </w:r>
+      <w:r>
+        <w:t xml:space="preserve">tier by hand. Across the 11,704 articles whose record names its sources, the</w:t>
+      </w:r>
+      <w:r>
+        <w:t xml:space="preserve"> </w:t>
+      </w:r>
+      <w:r>
+        <w:t xml:space="preserve">official source was unreachable for 20.0 per cent, covering 28.0 per cent of</w:t>
+      </w:r>
+      <w:r>
+        <w:t xml:space="preserve"> </w:t>
+      </w:r>
+      <w:r>
+        <w:t xml:space="preserve">instruments; 20.9 per cent were obtained through a web archive, two thirds of</w:t>
+      </w:r>
+      <w:r>
+        <w:t xml:space="preserve"> </w:t>
+      </w:r>
+      <w:r>
+        <w:t xml:space="preserve">those cases coinciding with a live source that would not respond; 8.2 per cent</w:t>
+      </w:r>
+      <w:r>
+        <w:t xml:space="preserve"> </w:t>
+      </w:r>
+      <w:r>
+        <w:t xml:space="preserve">required optical reconstruction; and 4.9 per cent record a defect in the</w:t>
+      </w:r>
+      <w:r>
+        <w:t xml:space="preserve"> </w:t>
+      </w:r>
+      <w:r>
+        <w:t xml:space="preserve">official text itself. Between a sixth and a quarter of the corpus, depending on</w:t>
+      </w:r>
+      <w:r>
+        <w:t xml:space="preserve"> </w:t>
+      </w:r>
+      <w:r>
+        <w:t xml:space="preserve">the unit counted, rests on evidence weaker than a cross-verified official</w:t>
+      </w:r>
+      <w:r>
+        <w:t xml:space="preserve"> </w:t>
+      </w:r>
+      <w:r>
+        <w:t xml:space="preserve">primary. In four instruments the official record contradicts itself: the</w:t>
+      </w:r>
+      <w:r>
+        <w:t xml:space="preserve"> </w:t>
+      </w:r>
+      <w:r>
+        <w:t xml:space="preserve">provision the portal displays and the amendment log the same portal publishes</w:t>
+      </w:r>
+      <w:r>
+        <w:t xml:space="preserve"> </w:t>
+      </w:r>
+      <w:r>
+        <w:t xml:space="preserve">do not agree. Three conclusions follow for publishers and users of official</w:t>
+      </w:r>
+      <w:r>
+        <w:t xml:space="preserve"> </w:t>
+      </w:r>
+      <w:r>
+        <w:t xml:space="preserve">data. Web archives are load-bearing infrastructure for public-record research</w:t>
+      </w:r>
+      <w:r>
+        <w:t xml:space="preserve"> </w:t>
+      </w:r>
+      <w:r>
+        <w:t xml:space="preserve">and hold that position with no mandate and no guarantee of permanence.</w:t>
+      </w:r>
+      <w:r>
+        <w:t xml:space="preserve"> </w:t>
+      </w:r>
+      <w:r>
+        <w:t xml:space="preserve">Availability and internal consistency are distinct properties needing separate</w:t>
+      </w:r>
+      <w:r>
+        <w:t xml:space="preserve"> </w:t>
+      </w:r>
+      <w:r>
+        <w:t xml:space="preserve">measurement. And a public dataset should carry the strength of the evidence</w:t>
+      </w:r>
+      <w:r>
+        <w:t xml:space="preserve"> </w:t>
+      </w:r>
+      <w:r>
+        <w:t xml:space="preserve">behind each record, for which we propose a minimal five-field schema derived</w:t>
+      </w:r>
+      <w:r>
+        <w:t xml:space="preserve"> </w:t>
+      </w:r>
+      <w:r>
+        <w:t xml:space="preserve">from what this corpus recorded in free text — and from the 24 per cent of its</w:t>
+      </w:r>
+      <w:r>
+        <w:t xml:space="preserve"> </w:t>
+      </w:r>
+      <w:r>
+        <w:t xml:space="preserve">own provenance values that turned out not to be provenance at all.</w:t>
+      </w:r>
+    </w:p>
+    <w:p>
+      <w:pPr>
+        <w:pStyle w:val="BodyText"/>
+      </w:pPr>
+      <w:r>
+        <w:rPr>
+          <w:bCs/>
+          <w:b/>
+        </w:rPr>
+        <w:t xml:space="preserve">Policy Significance Statement</w:t>
+      </w:r>
+    </w:p>
+    <w:p>
+      <w:pPr>
+        <w:pStyle w:val="BodyText"/>
+      </w:pPr>
+      <w:r>
+        <w:t xml:space="preserve">Governments publish their law online, and compliance systems, regulatory</w:t>
+      </w:r>
+      <w:r>
+        <w:t xml:space="preserve"> </w:t>
+      </w:r>
+      <w:r>
+        <w:t xml:space="preserve">technology and AI tools now consume those publications directly, without a</w:t>
+      </w:r>
+      <w:r>
+        <w:t xml:space="preserve"> </w:t>
+      </w:r>
+      <w:r>
+        <w:t xml:space="preserve">professional reader who might notice a problem. This article measures whether</w:t>
+      </w:r>
+      <w:r>
+        <w:t xml:space="preserve"> </w:t>
+      </w:r>
+      <w:r>
+        <w:t xml:space="preserve">one state’s official legal record was available and internally consistent when</w:t>
+      </w:r>
+      <w:r>
+        <w:t xml:space="preserve"> </w:t>
+      </w:r>
+      <w:r>
+        <w:t xml:space="preserve">someone tried to use it at scale. For a fifth of articles the official source</w:t>
+      </w:r>
+      <w:r>
+        <w:t xml:space="preserve"> </w:t>
+      </w:r>
+      <w:r>
+        <w:t xml:space="preserve">could not be reached; a fifth arrived through a web archive; one instrument in</w:t>
+      </w:r>
+      <w:r>
+        <w:t xml:space="preserve"> </w:t>
+      </w:r>
+      <w:r>
+        <w:t xml:space="preserve">seven had to be read as images; and in four instruments the record contradicts</w:t>
+      </w:r>
+      <w:r>
+        <w:t xml:space="preserve"> </w:t>
+      </w:r>
+      <w:r>
+        <w:t xml:space="preserve">itself. Nothing published alongside the text tells a user which case they are</w:t>
+      </w:r>
+      <w:r>
+        <w:t xml:space="preserve"> </w:t>
+      </w:r>
+      <w:r>
+        <w:t xml:space="preserve">in. We propose a five-field provenance schema that any publisher of official</w:t>
+      </w:r>
+      <w:r>
+        <w:t xml:space="preserve"> </w:t>
+      </w:r>
+      <w:r>
+        <w:t xml:space="preserve">data can populate at the point of collection, and which would make the</w:t>
+      </w:r>
+      <w:r>
+        <w:t xml:space="preserve"> </w:t>
+      </w:r>
+      <w:r>
+        <w:t xml:space="preserve">difference visible at negligible cost.</w:t>
       </w:r>
     </w:p>
     <w:p>

</xml_diff>